<commit_message>
docs: cập nhật HDSD theo đợt vá — hai thông điệp lỗi mới và hệ quả kho chưa cách ly
Thêm vào bảng tra lỗi: phân biệt "Tài khoản chưa được kích hoạt" (đã cấp, chưa
gán khoa) với "chưa gắn với khách hàng nào" (lỗi cấu hình). Trước bản vá V4 hai
tình huống này báo cùng một câu nên người trực gọi nhầm người mà xử.

Viết lại mục "cố ý chưa làm" về module kho theo hệ quả nghiệp vụ thật thay vì
ghi chú kỹ thuật: phiếu nhập kho có ghi số đơn hàng, nên tới khi bước 8 xong,
nhân viên khoa vẫn đọc được số đơn của khoa khác kèm mặt hàng và tổng tiền.
Kèm một câu cho người triển khai: nếu bệnh viện hỏi, đừng nói là đã cách ly xong.

Co-Authored-By: Claude Opus 5 (1M context) <noreply@anthropic.com>
</commit_message>
<xml_diff>
--- a/docs/HDSD-phan-quyen-khoa-phong.docx
+++ b/docs/HDSD-phan-quyen-khoa-phong.docx
@@ -2508,6 +2508,159 @@
           </w:p>
         </w:tc>
       </w:tr>
+      <w:tr>
+        <w:tc>
+          <w:tcPr>
+            <w:tcW w:type="dxa" w:w="2880"/>
+          </w:tcPr>
+          <w:p>
+            <w:r/>
+            <w:r>
+              <w:rPr>
+                <w:b w:val="0"/>
+                <w:i w:val="0"/>
+              </w:rPr>
+              <w:t xml:space="preserve">Khách báo </w:t>
+            </w:r>
+            <w:r>
+              <w:rPr>
+                <w:b/>
+                <w:i w:val="0"/>
+              </w:rPr>
+              <w:t>"Tài khoản chưa được kích hoạt"</w:t>
+            </w:r>
+          </w:p>
+        </w:tc>
+        <w:tc>
+          <w:tcPr>
+            <w:tcW w:type="dxa" w:w="2880"/>
+          </w:tcPr>
+          <w:p>
+            <w:r/>
+            <w:r>
+              <w:rPr>
+                <w:b w:val="0"/>
+                <w:i w:val="0"/>
+              </w:rPr>
+              <w:t>Tài khoản đã cấp nhưng chưa gán khoa và chưa bật</w:t>
+            </w:r>
+          </w:p>
+        </w:tc>
+        <w:tc>
+          <w:tcPr>
+            <w:tcW w:type="dxa" w:w="2880"/>
+          </w:tcPr>
+          <w:p>
+            <w:r/>
+            <w:r>
+              <w:rPr>
+                <w:b w:val="0"/>
+                <w:i w:val="0"/>
+              </w:rPr>
+              <w:t xml:space="preserve">Làm </w:t>
+            </w:r>
+            <w:r>
+              <w:rPr>
+                <w:b/>
+                <w:i w:val="0"/>
+              </w:rPr>
+              <w:t>bước 4</w:t>
+            </w:r>
+            <w:r>
+              <w:rPr>
+                <w:b w:val="0"/>
+                <w:i w:val="0"/>
+              </w:rPr>
+              <w:t xml:space="preserve"> — gán khoa phòng rồi tích Hoạt động</w:t>
+            </w:r>
+          </w:p>
+        </w:tc>
+      </w:tr>
+      <w:tr>
+        <w:tc>
+          <w:tcPr>
+            <w:tcW w:type="dxa" w:w="2880"/>
+          </w:tcPr>
+          <w:p>
+            <w:r/>
+            <w:r>
+              <w:rPr>
+                <w:b w:val="0"/>
+                <w:i w:val="0"/>
+              </w:rPr>
+              <w:t xml:space="preserve">Khách báo </w:t>
+            </w:r>
+            <w:r>
+              <w:rPr>
+                <w:b/>
+                <w:i w:val="0"/>
+              </w:rPr>
+              <w:t>"Tài khoản chưa gắn với khách hàng nào"</w:t>
+            </w:r>
+          </w:p>
+        </w:tc>
+        <w:tc>
+          <w:tcPr>
+            <w:tcW w:type="dxa" w:w="2880"/>
+          </w:tcPr>
+          <w:p>
+            <w:r/>
+            <w:r>
+              <w:rPr>
+                <w:b w:val="0"/>
+                <w:i w:val="0"/>
+              </w:rPr>
+              <w:t xml:space="preserve">Tài khoản </w:t>
+            </w:r>
+            <w:r>
+              <w:rPr>
+                <w:b/>
+                <w:i w:val="0"/>
+              </w:rPr>
+              <w:t>không có</w:t>
+            </w:r>
+            <w:r>
+              <w:rPr>
+                <w:b w:val="0"/>
+                <w:i w:val="0"/>
+              </w:rPr>
+              <w:t xml:space="preserve"> bản ghi Thành viên cổng nào — lỗi cấu hình</w:t>
+            </w:r>
+          </w:p>
+        </w:tc>
+        <w:tc>
+          <w:tcPr>
+            <w:tcW w:type="dxa" w:w="2880"/>
+          </w:tcPr>
+          <w:p>
+            <w:r/>
+            <w:r>
+              <w:rPr>
+                <w:b w:val="0"/>
+                <w:i w:val="0"/>
+              </w:rPr>
+              <w:t xml:space="preserve">Tạo </w:t>
+            </w:r>
+            <w:r>
+              <w:rPr>
+                <w:rFonts w:ascii="Consolas" w:hAnsi="Consolas"/>
+                <w:b w:val="0"/>
+                <w:i w:val="0"/>
+                <w:color w:val="B03030"/>
+                <w:sz w:val="19"/>
+              </w:rPr>
+              <w:t>Portal Member</w:t>
+            </w:r>
+            <w:r>
+              <w:rPr>
+                <w:b w:val="0"/>
+                <w:i w:val="0"/>
+              </w:rPr>
+              <w:t xml:space="preserve"> cho tài khoản đó. Hai thông báo này khác nhau, đừng nhầm</w:t>
+            </w:r>
+          </w:p>
+        </w:tc>
+      </w:tr>
     </w:tbl>
     <w:p/>
     <w:p>
@@ -2801,35 +2954,51 @@
           <w:b w:val="0"/>
           <w:i w:val="0"/>
         </w:rPr>
-        <w:t xml:space="preserve"> Nhân viên khoa vẫn thấy toàn bộ màn Kho. Thuộc bước 8 của thiết kế. </w:t>
+        <w:t xml:space="preserve"> Nhân viên khoa vẫn thấy toàn bộ màn Kho — thuộc bước 8 của thiết kế.</w:t>
+      </w:r>
+    </w:p>
+    <w:p>
+      <w:r>
+        <w:rPr>
+          <w:b/>
+          <w:i w:val="0"/>
+        </w:rPr>
+        <w:t>Điều này có hệ quả cần biết, không phải chi tiết kỹ thuật:</w:t>
+      </w:r>
+      <w:r>
+        <w:rPr>
+          <w:b w:val="0"/>
+          <w:i w:val="0"/>
+        </w:rPr>
+        <w:t xml:space="preserve"> phiếu nhập kho có ghi số đơn hàng sinh ra nó. Nên tới khi bước 8 xong, một nhân viên khoa vẫn có thể mở màn Kho, xem phiếu nhập và </w:t>
       </w:r>
       <w:r>
         <w:rPr>
           <w:b/>
           <w:i w:val="0"/>
         </w:rPr>
-        <w:t>Và có một việc phải sửa trước khi làm bước đó:</w:t>
+        <w:t>đọc được số đơn của khoa khác</w:t>
       </w:r>
       <w:r>
         <w:rPr>
           <w:b w:val="0"/>
           <w:i w:val="0"/>
         </w:rPr>
-        <w:t xml:space="preserve"> hai chỗ trong module kho đang giả định mọi khoa phòng đều gắn kho, nên một khoa phòng </w:t>
+        <w:t xml:space="preserve"> kèm mặt hàng và tổng tiền của đợt giao đó. Họ không mở được chính đơn hàng, nhưng cách ly theo khoa </w:t>
       </w:r>
       <w:r>
         <w:rPr>
           <w:b/>
           <w:i w:val="0"/>
         </w:rPr>
-        <w:t>không gắn kho</w:t>
+        <w:t>chưa trọn vẹn</w:t>
       </w:r>
       <w:r>
         <w:rPr>
           <w:b w:val="0"/>
           <w:i w:val="0"/>
         </w:rPr>
-        <w:t xml:space="preserve"> sẽ báo lỗi quyền khi thao tác. Chưa hỏng vì chưa ai tạo khoa phòng như vậy — nhưng sẽ hỏng đúng lần đầu bật cho một bệnh viện chưa mở kho.</w:t>
+        <w:t xml:space="preserve"> chừng nào bước 8 chưa chạy. Nếu bệnh viện hỏi, đừng nói là đã cách ly xong.</w:t>
       </w:r>
     </w:p>
     <w:p>

</xml_diff>

<commit_message>
docs(HDSD): them muc 4 luong de xuat mua + cap nhat checklist trien khai
- Muc 4 moi: ai lam duoc gi, vong doi phieu, ma phieu, khoi truy vet, cach
  quan ly duyet, sua so luong sau bao gia, quan ly dat truc tiep, thong bao
  theo khoa. Doi so muc cu 4/5/6 -> 5/6/7.
- Checklist: ban nay co HAI patch khong phai mot; thieu patch v1_24 thi chot
  'nhan vien khong sua so luong sau duyet' khong co gi de doc -> he thong
  CHAN nhan vien kem thong bao, khong mo toang.
- Phu luc: them custom_de_xuat va custom_ma_tra_cuu.
- Muc 'co y CHUA lam': bo hai muc da xong, them ghi chu vong duyet sua chua
  ghi moc rieng.

Co-Authored-By: Claude Opus 5 (1M context) <noreply@anthropic.com>
</commit_message>
<xml_diff>
--- a/docs/HDSD-phan-quyen-khoa-phong.docx
+++ b/docs/HDSD-phan-quyen-khoa-phong.docx
@@ -2035,7 +2035,1476 @@
         <w:pStyle w:val="Heading2"/>
       </w:pPr>
       <w:r>
-        <w:t>4. Gặp lỗi thì tra ở đây</w:t>
+        <w:t>4. Luồng đề xuất mua — nhân viên đề xuất, quản lý duyệt</w:t>
+      </w:r>
+    </w:p>
+    <w:p>
+      <w:r>
+        <w:rPr>
+          <w:b/>
+          <w:i w:val="0"/>
+        </w:rPr>
+        <w:t>Đây là phần mới nhất, và là lý do cả đề án tồn tại.</w:t>
+      </w:r>
+      <w:r>
+        <w:rPr>
+          <w:b w:val="0"/>
+          <w:i w:val="0"/>
+        </w:rPr>
+        <w:t xml:space="preserve"> Trước đây một bệnh viện một tài khoản, ai cũng đặt hàng thẳng. Giờ nhân viên khoa </w:t>
+      </w:r>
+      <w:r>
+        <w:rPr>
+          <w:b/>
+          <w:i w:val="0"/>
+        </w:rPr>
+        <w:t>đề xuất</w:t>
+      </w:r>
+      <w:r>
+        <w:rPr>
+          <w:b w:val="0"/>
+          <w:i w:val="0"/>
+        </w:rPr>
+        <w:t xml:space="preserve">, quản lý </w:t>
+      </w:r>
+      <w:r>
+        <w:rPr>
+          <w:b/>
+          <w:i w:val="0"/>
+        </w:rPr>
+        <w:t>duyệt</w:t>
+      </w:r>
+      <w:r>
+        <w:rPr>
+          <w:b w:val="0"/>
+          <w:i w:val="0"/>
+        </w:rPr>
+        <w:t>, rồi đơn mới sang Miyano.</w:t>
+      </w:r>
+    </w:p>
+    <w:p>
+      <w:pPr>
+        <w:pStyle w:val="Heading3"/>
+      </w:pPr>
+      <w:r>
+        <w:t>Ai làm được gì</w:t>
+      </w:r>
+    </w:p>
+    <w:tbl>
+      <w:tblPr>
+        <w:tblStyle w:val="TableGrid"/>
+        <w:tblW w:type="auto" w:w="0"/>
+        <w:tblLook w:firstColumn="1" w:firstRow="1" w:lastColumn="0" w:lastRow="0" w:noHBand="0" w:noVBand="1" w:val="04A0"/>
+      </w:tblPr>
+      <w:tblGrid>
+        <w:gridCol w:w="2880"/>
+        <w:gridCol w:w="2880"/>
+        <w:gridCol w:w="2880"/>
+      </w:tblGrid>
+      <w:tr>
+        <w:tc>
+          <w:tcPr>
+            <w:tcW w:type="dxa" w:w="2880"/>
+          </w:tcPr>
+          <w:p>
+            <w:r>
+              <w:rPr>
+                <w:b/>
+              </w:rPr>
+            </w:r>
+            <w:r>
+              <w:rPr>
+                <w:b/>
+                <w:i w:val="0"/>
+              </w:rPr>
+              <w:t>Việc</w:t>
+            </w:r>
+          </w:p>
+        </w:tc>
+        <w:tc>
+          <w:tcPr>
+            <w:tcW w:type="dxa" w:w="2880"/>
+          </w:tcPr>
+          <w:p>
+            <w:r>
+              <w:rPr>
+                <w:b/>
+              </w:rPr>
+            </w:r>
+            <w:r>
+              <w:rPr>
+                <w:b/>
+                <w:i w:val="0"/>
+              </w:rPr>
+              <w:t>Nhân viên khoa</w:t>
+            </w:r>
+          </w:p>
+        </w:tc>
+        <w:tc>
+          <w:tcPr>
+            <w:tcW w:type="dxa" w:w="2880"/>
+          </w:tcPr>
+          <w:p>
+            <w:r>
+              <w:rPr>
+                <w:b/>
+              </w:rPr>
+            </w:r>
+            <w:r>
+              <w:rPr>
+                <w:b/>
+                <w:i w:val="0"/>
+              </w:rPr>
+              <w:t>Quản lý</w:t>
+            </w:r>
+          </w:p>
+        </w:tc>
+      </w:tr>
+      <w:tr>
+        <w:tc>
+          <w:tcPr>
+            <w:tcW w:type="dxa" w:w="2880"/>
+          </w:tcPr>
+          <w:p>
+            <w:r/>
+            <w:r>
+              <w:rPr>
+                <w:b w:val="0"/>
+                <w:i w:val="0"/>
+              </w:rPr>
+              <w:t>Lập phiếu đề xuất</w:t>
+            </w:r>
+          </w:p>
+        </w:tc>
+        <w:tc>
+          <w:tcPr>
+            <w:tcW w:type="dxa" w:w="2880"/>
+          </w:tcPr>
+          <w:p>
+            <w:r/>
+            <w:r>
+              <w:rPr>
+                <w:b w:val="0"/>
+                <w:i w:val="0"/>
+              </w:rPr>
+              <w:t>✔</w:t>
+            </w:r>
+          </w:p>
+        </w:tc>
+        <w:tc>
+          <w:tcPr>
+            <w:tcW w:type="dxa" w:w="2880"/>
+          </w:tcPr>
+          <w:p>
+            <w:r/>
+            <w:r>
+              <w:rPr>
+                <w:b w:val="0"/>
+                <w:i w:val="0"/>
+              </w:rPr>
+              <w:t>✔ (qua giỏ hàng)</w:t>
+            </w:r>
+          </w:p>
+        </w:tc>
+      </w:tr>
+      <w:tr>
+        <w:tc>
+          <w:tcPr>
+            <w:tcW w:type="dxa" w:w="2880"/>
+          </w:tcPr>
+          <w:p>
+            <w:r/>
+            <w:r>
+              <w:rPr>
+                <w:b w:val="0"/>
+                <w:i w:val="0"/>
+              </w:rPr>
+              <w:t xml:space="preserve">Sửa số lượng khi phiếu còn </w:t>
+            </w:r>
+            <w:r>
+              <w:rPr>
+                <w:b/>
+                <w:i w:val="0"/>
+              </w:rPr>
+              <w:t>Nháp</w:t>
+            </w:r>
+          </w:p>
+        </w:tc>
+        <w:tc>
+          <w:tcPr>
+            <w:tcW w:type="dxa" w:w="2880"/>
+          </w:tcPr>
+          <w:p>
+            <w:r/>
+            <w:r>
+              <w:rPr>
+                <w:b w:val="0"/>
+                <w:i w:val="0"/>
+              </w:rPr>
+              <w:t>✔</w:t>
+            </w:r>
+          </w:p>
+        </w:tc>
+        <w:tc>
+          <w:tcPr>
+            <w:tcW w:type="dxa" w:w="2880"/>
+          </w:tcPr>
+          <w:p>
+            <w:r/>
+            <w:r>
+              <w:rPr>
+                <w:b w:val="0"/>
+                <w:i w:val="0"/>
+              </w:rPr>
+              <w:t>✔</w:t>
+            </w:r>
+          </w:p>
+        </w:tc>
+      </w:tr>
+      <w:tr>
+        <w:tc>
+          <w:tcPr>
+            <w:tcW w:type="dxa" w:w="2880"/>
+          </w:tcPr>
+          <w:p>
+            <w:r/>
+            <w:r>
+              <w:rPr>
+                <w:b w:val="0"/>
+                <w:i w:val="0"/>
+              </w:rPr>
+              <w:t xml:space="preserve">Xoá phiếu </w:t>
+            </w:r>
+            <w:r>
+              <w:rPr>
+                <w:b/>
+                <w:i w:val="0"/>
+              </w:rPr>
+              <w:t>Nháp</w:t>
+            </w:r>
+          </w:p>
+        </w:tc>
+        <w:tc>
+          <w:tcPr>
+            <w:tcW w:type="dxa" w:w="2880"/>
+          </w:tcPr>
+          <w:p>
+            <w:r/>
+            <w:r>
+              <w:rPr>
+                <w:b w:val="0"/>
+                <w:i w:val="0"/>
+              </w:rPr>
+              <w:t>✔ (phiếu của mình)</w:t>
+            </w:r>
+          </w:p>
+        </w:tc>
+        <w:tc>
+          <w:tcPr>
+            <w:tcW w:type="dxa" w:w="2880"/>
+          </w:tcPr>
+          <w:p>
+            <w:r/>
+            <w:r>
+              <w:rPr>
+                <w:b w:val="0"/>
+                <w:i w:val="0"/>
+              </w:rPr>
+              <w:t>✔</w:t>
+            </w:r>
+          </w:p>
+        </w:tc>
+      </w:tr>
+      <w:tr>
+        <w:tc>
+          <w:tcPr>
+            <w:tcW w:type="dxa" w:w="2880"/>
+          </w:tcPr>
+          <w:p>
+            <w:r/>
+            <w:r>
+              <w:rPr>
+                <w:b w:val="0"/>
+                <w:i w:val="0"/>
+              </w:rPr>
+              <w:t>Gửi duyệt</w:t>
+            </w:r>
+          </w:p>
+        </w:tc>
+        <w:tc>
+          <w:tcPr>
+            <w:tcW w:type="dxa" w:w="2880"/>
+          </w:tcPr>
+          <w:p>
+            <w:r/>
+            <w:r>
+              <w:rPr>
+                <w:b w:val="0"/>
+                <w:i w:val="0"/>
+              </w:rPr>
+              <w:t>✔ (phiếu của mình)</w:t>
+            </w:r>
+          </w:p>
+        </w:tc>
+        <w:tc>
+          <w:tcPr>
+            <w:tcW w:type="dxa" w:w="2880"/>
+          </w:tcPr>
+          <w:p>
+            <w:r/>
+            <w:r>
+              <w:rPr>
+                <w:b w:val="0"/>
+                <w:i w:val="0"/>
+              </w:rPr>
+              <w:t>—</w:t>
+            </w:r>
+          </w:p>
+        </w:tc>
+      </w:tr>
+      <w:tr>
+        <w:tc>
+          <w:tcPr>
+            <w:tcW w:type="dxa" w:w="2880"/>
+          </w:tcPr>
+          <w:p>
+            <w:r/>
+            <w:r>
+              <w:rPr>
+                <w:b w:val="0"/>
+                <w:i w:val="0"/>
+              </w:rPr>
+              <w:t>Duyệt / Từ chối</w:t>
+            </w:r>
+          </w:p>
+        </w:tc>
+        <w:tc>
+          <w:tcPr>
+            <w:tcW w:type="dxa" w:w="2880"/>
+          </w:tcPr>
+          <w:p>
+            <w:r/>
+            <w:r>
+              <w:rPr>
+                <w:b w:val="0"/>
+                <w:i w:val="0"/>
+              </w:rPr>
+              <w:t>✘</w:t>
+            </w:r>
+          </w:p>
+        </w:tc>
+        <w:tc>
+          <w:tcPr>
+            <w:tcW w:type="dxa" w:w="2880"/>
+          </w:tcPr>
+          <w:p>
+            <w:r/>
+            <w:r>
+              <w:rPr>
+                <w:b w:val="0"/>
+                <w:i w:val="0"/>
+              </w:rPr>
+              <w:t>✔</w:t>
+            </w:r>
+          </w:p>
+        </w:tc>
+      </w:tr>
+      <w:tr>
+        <w:tc>
+          <w:tcPr>
+            <w:tcW w:type="dxa" w:w="2880"/>
+          </w:tcPr>
+          <w:p>
+            <w:r/>
+            <w:r>
+              <w:rPr>
+                <w:b w:val="0"/>
+                <w:i w:val="0"/>
+              </w:rPr>
+              <w:t>Huỷ phiếu đã gửi</w:t>
+            </w:r>
+          </w:p>
+        </w:tc>
+        <w:tc>
+          <w:tcPr>
+            <w:tcW w:type="dxa" w:w="2880"/>
+          </w:tcPr>
+          <w:p>
+            <w:r/>
+            <w:r>
+              <w:rPr>
+                <w:b w:val="0"/>
+                <w:i w:val="0"/>
+              </w:rPr>
+              <w:t>✘</w:t>
+            </w:r>
+          </w:p>
+        </w:tc>
+        <w:tc>
+          <w:tcPr>
+            <w:tcW w:type="dxa" w:w="2880"/>
+          </w:tcPr>
+          <w:p>
+            <w:r/>
+            <w:r>
+              <w:rPr>
+                <w:b w:val="0"/>
+                <w:i w:val="0"/>
+              </w:rPr>
+              <w:t>✔</w:t>
+            </w:r>
+          </w:p>
+        </w:tc>
+      </w:tr>
+      <w:tr>
+        <w:tc>
+          <w:tcPr>
+            <w:tcW w:type="dxa" w:w="2880"/>
+          </w:tcPr>
+          <w:p>
+            <w:r/>
+            <w:r>
+              <w:rPr>
+                <w:b w:val="0"/>
+                <w:i w:val="0"/>
+              </w:rPr>
+              <w:t>Đặt hàng thẳng, không qua duyệt</w:t>
+            </w:r>
+          </w:p>
+        </w:tc>
+        <w:tc>
+          <w:tcPr>
+            <w:tcW w:type="dxa" w:w="2880"/>
+          </w:tcPr>
+          <w:p>
+            <w:r/>
+            <w:r>
+              <w:rPr>
+                <w:b w:val="0"/>
+                <w:i w:val="0"/>
+              </w:rPr>
+              <w:t>✘</w:t>
+            </w:r>
+          </w:p>
+        </w:tc>
+        <w:tc>
+          <w:tcPr>
+            <w:tcW w:type="dxa" w:w="2880"/>
+          </w:tcPr>
+          <w:p>
+            <w:r/>
+            <w:r>
+              <w:rPr>
+                <w:b w:val="0"/>
+                <w:i w:val="0"/>
+              </w:rPr>
+              <w:t>✔</w:t>
+            </w:r>
+          </w:p>
+        </w:tc>
+      </w:tr>
+    </w:tbl>
+    <w:p/>
+    <w:p>
+      <w:r>
+        <w:rPr>
+          <w:b/>
+          <w:i w:val="0"/>
+        </w:rPr>
+        <w:t>Nhân viên khoa không đặt hàng thẳng được nữa.</w:t>
+      </w:r>
+      <w:r>
+        <w:rPr>
+          <w:b w:val="0"/>
+          <w:i w:val="0"/>
+        </w:rPr>
+        <w:t xml:space="preserve"> Bấm đặt trên giỏ hàng sẽ nhận thông báo hướng sang chức năng gửi duyệt. Đây là thay đổi hành vi có chủ đích — nếu để họ đặt thẳng thì cổng duyệt chỉ là trang trí.</w:t>
+      </w:r>
+    </w:p>
+    <w:p>
+      <w:pPr>
+        <w:pStyle w:val="Heading3"/>
+      </w:pPr>
+      <w:r>
+        <w:t>Vòng đời một phiếu</w:t>
+      </w:r>
+    </w:p>
+    <w:p>
+      <w:pPr>
+        <w:ind w:left="360"/>
+      </w:pPr>
+      <w:r>
+        <w:rPr>
+          <w:rFonts w:ascii="Consolas" w:hAnsi="Consolas"/>
+          <w:sz w:val="18"/>
+        </w:rPr>
+        <w:t>Nháp ──Gửi duyệt──► Chờ duyệt ──Duyệt──► Đã duyệt ──► sinh đơn hàng gửi Miyano</w:t>
+        <w:br/>
+        <w:t xml:space="preserve"> │                      │</w:t>
+        <w:br/>
+        <w:t xml:space="preserve"> │                      └──Từ chối (bắt buộc ghi lý do)──► Từ chối ──sửa──► Chờ duyệt</w:t>
+        <w:br/>
+        <w:t xml:space="preserve"> └──Xoá thật                Chờ duyệt trở đi ──Huỷ──► Đã huỷ (phiếu còn nguyên)</w:t>
+      </w:r>
+    </w:p>
+    <w:p>
+      <w:r>
+        <w:rPr>
+          <w:b/>
+          <w:i w:val="0"/>
+        </w:rPr>
+        <w:t>Xoá và huỷ là hai việc khác nhau.</w:t>
+      </w:r>
+      <w:r>
+        <w:rPr>
+          <w:b w:val="0"/>
+          <w:i w:val="0"/>
+        </w:rPr>
+        <w:t xml:space="preserve"> Phiếu </w:t>
+      </w:r>
+      <w:r>
+        <w:rPr>
+          <w:b/>
+          <w:i w:val="0"/>
+        </w:rPr>
+        <w:t>Nháp</w:t>
+      </w:r>
+      <w:r>
+        <w:rPr>
+          <w:b w:val="0"/>
+          <w:i w:val="0"/>
+        </w:rPr>
+        <w:t xml:space="preserve"> chưa ai ngoài người lập nhìn thấy, chưa có mã — xoá thật khỏi hệ thống. Từ </w:t>
+      </w:r>
+      <w:r>
+        <w:rPr>
+          <w:b/>
+          <w:i w:val="0"/>
+        </w:rPr>
+        <w:t>Chờ duyệt</w:t>
+      </w:r>
+      <w:r>
+        <w:rPr>
+          <w:b w:val="0"/>
+          <w:i w:val="0"/>
+        </w:rPr>
+        <w:t xml:space="preserve"> trở đi phiếu đã có mã và đã vào hàng chờ của quản lý — chỉ </w:t>
+      </w:r>
+      <w:r>
+        <w:rPr>
+          <w:b/>
+          <w:i w:val="0"/>
+        </w:rPr>
+        <w:t>huỷ</w:t>
+      </w:r>
+      <w:r>
+        <w:rPr>
+          <w:b w:val="0"/>
+          <w:i w:val="0"/>
+        </w:rPr>
+        <w:t>, phiếu ở lại để truy vết. Nút trên màn hình ghi đúng việc đang làm: "Xoá" ở Nháp, "Huỷ phiếu" từ Chờ duyệt trở đi.</w:t>
+      </w:r>
+    </w:p>
+    <w:p>
+      <w:pPr>
+        <w:pStyle w:val="Heading3"/>
+      </w:pPr>
+      <w:r>
+        <w:t>Mã phiếu</w:t>
+      </w:r>
+    </w:p>
+    <w:p>
+      <w:pPr>
+        <w:ind w:left="360"/>
+      </w:pPr>
+      <w:r>
+        <w:rPr>
+          <w:rFonts w:ascii="Consolas" w:hAnsi="Consolas"/>
+          <w:sz w:val="18"/>
+        </w:rPr>
+        <w:t>BM-HUYETHOC-260819-01</w:t>
+        <w:br/>
+        <w:t>│   │        │      └─ số thứ tự trong ngày của chính khoa đó</w:t>
+        <w:br/>
+        <w:t>│   │        └─ ngày gửi duyệt (YYMMDD)</w:t>
+        <w:br/>
+        <w:t>│   └─ mã khoa phòng</w:t>
+        <w:br/>
+        <w:t>└─ mã ngắn bệnh viện</w:t>
+      </w:r>
+    </w:p>
+    <w:p>
+      <w:r>
+        <w:rPr>
+          <w:b/>
+          <w:i w:val="0"/>
+        </w:rPr>
+        <w:t>Mã sinh lúc bấm Gửi duyệt</w:t>
+      </w:r>
+      <w:r>
+        <w:rPr>
+          <w:b w:val="0"/>
+          <w:i w:val="0"/>
+        </w:rPr>
+        <w:t xml:space="preserve">, không sớm hơn — lúc còn Nháp giỏ hàng vẫn đang đổi. Sinh </w:t>
+      </w:r>
+      <w:r>
+        <w:rPr>
+          <w:b/>
+          <w:i w:val="0"/>
+        </w:rPr>
+        <w:t>đúng một lần</w:t>
+      </w:r>
+      <w:r>
+        <w:rPr>
+          <w:b w:val="0"/>
+          <w:i w:val="0"/>
+        </w:rPr>
+        <w:t>: phiếu bị từ chối rồi gửi lại vẫn giữ mã cũ, vì quản lý và khoa đã gọi tên nó bằng mã đó trong lúc trao đổi. Không sửa tay được.</w:t>
+      </w:r>
+    </w:p>
+    <w:p>
+      <w:r>
+        <w:rPr>
+          <w:b w:val="0"/>
+          <w:i w:val="0"/>
+        </w:rPr>
+        <w:t>Vượt 99 phiếu cùng khoa trong một ngày thì tràn sang 3 chữ số (</w:t>
+      </w:r>
+      <w:r>
+        <w:rPr>
+          <w:rFonts w:ascii="Consolas" w:hAnsi="Consolas"/>
+          <w:b w:val="0"/>
+          <w:i w:val="0"/>
+          <w:color w:val="B03030"/>
+          <w:sz w:val="19"/>
+        </w:rPr>
+        <w:t>…-100</w:t>
+      </w:r>
+      <w:r>
+        <w:rPr>
+          <w:b w:val="0"/>
+          <w:i w:val="0"/>
+        </w:rPr>
+        <w:t>), không quay vòng — mã trùng tệ hơn mã dài.</w:t>
+      </w:r>
+    </w:p>
+    <w:p>
+      <w:r>
+        <w:rPr>
+          <w:b w:val="0"/>
+          <w:i w:val="0"/>
+        </w:rPr>
+        <w:t xml:space="preserve">Đơn quản lý đặt cho </w:t>
+      </w:r>
+      <w:r>
+        <w:rPr>
+          <w:b/>
+          <w:i w:val="0"/>
+        </w:rPr>
+        <w:t>toàn viện</w:t>
+      </w:r>
+      <w:r>
+        <w:rPr>
+          <w:b w:val="0"/>
+          <w:i w:val="0"/>
+        </w:rPr>
+        <w:t xml:space="preserve"> dùng mã khoa dành riêng </w:t>
+      </w:r>
+      <w:r>
+        <w:rPr>
+          <w:rFonts w:ascii="Consolas" w:hAnsi="Consolas"/>
+          <w:b w:val="0"/>
+          <w:i w:val="0"/>
+          <w:color w:val="B03030"/>
+          <w:sz w:val="19"/>
+        </w:rPr>
+        <w:t>CHUNG</w:t>
+      </w:r>
+      <w:r>
+        <w:rPr>
+          <w:b w:val="0"/>
+          <w:i w:val="0"/>
+        </w:rPr>
+        <w:t xml:space="preserve">: </w:t>
+      </w:r>
+      <w:r>
+        <w:rPr>
+          <w:rFonts w:ascii="Consolas" w:hAnsi="Consolas"/>
+          <w:b w:val="0"/>
+          <w:i w:val="0"/>
+          <w:color w:val="B03030"/>
+          <w:sz w:val="19"/>
+        </w:rPr>
+        <w:t>BM-CHUNG-260819-01</w:t>
+      </w:r>
+      <w:r>
+        <w:rPr>
+          <w:b w:val="0"/>
+          <w:i w:val="0"/>
+        </w:rPr>
+        <w:t>.</w:t>
+      </w:r>
+    </w:p>
+    <w:p>
+      <w:pPr>
+        <w:pStyle w:val="Heading3"/>
+      </w:pPr>
+      <w:r>
+        <w:t>Ba thứ ghi trên phiếu để sau này truy vết</w:t>
+      </w:r>
+    </w:p>
+    <w:p>
+      <w:r>
+        <w:rPr>
+          <w:b w:val="0"/>
+          <w:i w:val="0"/>
+        </w:rPr>
+        <w:t>Hiện ngay đầu phiếu, không phải đi tìm trong lịch sử:</w:t>
+      </w:r>
+    </w:p>
+    <w:p>
+      <w:pPr>
+        <w:pStyle w:val="ListBullet"/>
+      </w:pPr>
+      <w:r>
+        <w:rPr>
+          <w:b/>
+          <w:i w:val="0"/>
+        </w:rPr>
+        <w:t>Người yêu cầu</w:t>
+      </w:r>
+      <w:r>
+        <w:rPr>
+          <w:b w:val="0"/>
+          <w:i w:val="0"/>
+        </w:rPr>
+        <w:t xml:space="preserve"> — hệ thống ghi từ tài khoản thao tác, không gõ tay.</w:t>
+      </w:r>
+    </w:p>
+    <w:p>
+      <w:pPr>
+        <w:pStyle w:val="ListBullet"/>
+      </w:pPr>
+      <w:r>
+        <w:rPr>
+          <w:b/>
+          <w:i w:val="0"/>
+        </w:rPr>
+        <w:t>Thời điểm gửi</w:t>
+      </w:r>
+      <w:r>
+        <w:rPr>
+          <w:b w:val="0"/>
+          <w:i w:val="0"/>
+        </w:rPr>
+        <w:t xml:space="preserve"> — ghi lúc bấm Gửi duyệt, không phải lúc tạo nháp. Nháp soạn ba ngày rồi mới gửi thì mốc truy vết là lúc gửi.</w:t>
+      </w:r>
+    </w:p>
+    <w:p>
+      <w:pPr>
+        <w:pStyle w:val="ListBullet"/>
+      </w:pPr>
+      <w:r>
+        <w:rPr>
+          <w:b/>
+          <w:i w:val="0"/>
+        </w:rPr>
+        <w:t>Lý do yêu cầu</w:t>
+      </w:r>
+      <w:r>
+        <w:rPr>
+          <w:b w:val="0"/>
+          <w:i w:val="0"/>
+        </w:rPr>
+        <w:t xml:space="preserve"> — </w:t>
+      </w:r>
+      <w:r>
+        <w:rPr>
+          <w:b/>
+          <w:i w:val="0"/>
+        </w:rPr>
+        <w:t>bắt buộc khi Gửi duyệt</w:t>
+      </w:r>
+      <w:r>
+        <w:rPr>
+          <w:b w:val="0"/>
+          <w:i w:val="0"/>
+        </w:rPr>
+        <w:t>, không bắt lúc lưu nháp. Bắt điền ngay từ dòng đầu sẽ khiến người ta gõ "abc" cho xong.</w:t>
+      </w:r>
+    </w:p>
+    <w:p>
+      <w:pPr>
+        <w:pStyle w:val="Heading3"/>
+      </w:pPr>
+      <w:r>
+        <w:t>Quản lý duyệt như thế nào</w:t>
+      </w:r>
+    </w:p>
+    <w:p>
+      <w:r>
+        <w:rPr>
+          <w:b w:val="0"/>
+          <w:i w:val="0"/>
+        </w:rPr>
+        <w:t xml:space="preserve">Quản lý sửa được </w:t>
+      </w:r>
+      <w:r>
+        <w:rPr>
+          <w:b/>
+          <w:i w:val="0"/>
+        </w:rPr>
+        <w:t>cột Số lượng duyệt</w:t>
+      </w:r>
+      <w:r>
+        <w:rPr>
+          <w:b w:val="0"/>
+          <w:i w:val="0"/>
+        </w:rPr>
+        <w:t xml:space="preserve">, không sửa được cột Số lượng đề xuất — cột đó </w:t>
+      </w:r>
+      <w:r>
+        <w:rPr>
+          <w:b/>
+          <w:i w:val="0"/>
+        </w:rPr>
+        <w:t>khoá vĩnh viễn</w:t>
+      </w:r>
+      <w:r>
+        <w:rPr>
+          <w:b w:val="0"/>
+          <w:i w:val="0"/>
+        </w:rPr>
+        <w:t xml:space="preserve"> từ lúc khoa bấm gửi. Đó là cách hệ thống trả lời được câu "khoa xin gì / duyệt gì" mà không cần lưu hai bản dữ liệu song song.</w:t>
+      </w:r>
+    </w:p>
+    <w:p>
+      <w:pPr>
+        <w:pStyle w:val="ListBullet"/>
+      </w:pPr>
+      <w:r>
+        <w:rPr>
+          <w:b w:val="0"/>
+          <w:i w:val="0"/>
+        </w:rPr>
+        <w:t xml:space="preserve">Bỏ một mặt hàng = </w:t>
+      </w:r>
+      <w:r>
+        <w:rPr>
+          <w:b/>
+          <w:i w:val="0"/>
+        </w:rPr>
+        <w:t>hạ Số lượng duyệt về 0</w:t>
+      </w:r>
+      <w:r>
+        <w:rPr>
+          <w:b w:val="0"/>
+          <w:i w:val="0"/>
+        </w:rPr>
+        <w:t>, không xoá dòng.</w:t>
+      </w:r>
+    </w:p>
+    <w:p>
+      <w:pPr>
+        <w:pStyle w:val="ListBullet"/>
+      </w:pPr>
+      <w:r>
+        <w:rPr>
+          <w:b w:val="0"/>
+          <w:i w:val="0"/>
+        </w:rPr>
+        <w:t>Thêm mặt hàng = dòng mới, Số lượng đề xuất bằng 0, đánh dấu "Quản lý thêm".</w:t>
+      </w:r>
+    </w:p>
+    <w:p>
+      <w:pPr>
+        <w:pStyle w:val="ListBullet"/>
+      </w:pPr>
+      <w:r>
+        <w:rPr>
+          <w:b w:val="0"/>
+          <w:i w:val="0"/>
+        </w:rPr>
+        <w:t>Chỉ dòng có Số lượng duyệt lớn hơn 0 mới đi vào đơn hàng gửi Miyano.</w:t>
+      </w:r>
+    </w:p>
+    <w:p>
+      <w:r>
+        <w:rPr>
+          <w:b/>
+          <w:i w:val="0"/>
+        </w:rPr>
+        <w:t>Hết hạn mức hợp đồng thì việc duyệt thất bại kèm tên khoa đã tiêu mất</w:t>
+      </w:r>
+      <w:r>
+        <w:rPr>
+          <w:b w:val="0"/>
+          <w:i w:val="0"/>
+        </w:rPr>
+        <w:t xml:space="preserve"> — hệ thống không lặng lẽ cắt số lượng xuống. Hạn mức là tài nguyên chung giữa các khoa; trước đây một bệnh viện một tài khoản nên chuyện này không xảy ra.</w:t>
+      </w:r>
+    </w:p>
+    <w:p>
+      <w:r>
+        <w:rPr>
+          <w:b/>
+          <w:i w:val="0"/>
+        </w:rPr>
+        <w:t>Giá tính lại tại thời điểm duyệt.</w:t>
+      </w:r>
+      <w:r>
+        <w:rPr>
+          <w:b w:val="0"/>
+          <w:i w:val="0"/>
+        </w:rPr>
+        <w:t xml:space="preserve"> Nếu khác giá khoa đã nhìn thấy lúc gửi, hệ thống trả về cảnh báo lệch giá — </w:t>
+      </w:r>
+      <w:r>
+        <w:rPr>
+          <w:b/>
+          <w:i w:val="0"/>
+        </w:rPr>
+        <w:t>không chặn việc duyệt</w:t>
+      </w:r>
+      <w:r>
+        <w:rPr>
+          <w:b w:val="0"/>
+          <w:i w:val="0"/>
+        </w:rPr>
+        <w:t>, chỉ báo.</w:t>
+      </w:r>
+    </w:p>
+    <w:p>
+      <w:pPr>
+        <w:pStyle w:val="Heading3"/>
+      </w:pPr>
+      <w:r>
+        <w:t>Sửa số lượng sau khi Miyano đã báo giá</w:t>
+      </w:r>
+    </w:p>
+    <w:p>
+      <w:r>
+        <w:rPr>
+          <w:b w:val="0"/>
+          <w:i w:val="0"/>
+        </w:rPr>
+        <w:t>Đây là chỗ dễ hiểu nhầm nhất, nên nói rõ:</w:t>
+      </w:r>
+    </w:p>
+    <w:p>
+      <w:pPr>
+        <w:pStyle w:val="ListBullet"/>
+      </w:pPr>
+      <w:r>
+        <w:rPr>
+          <w:b w:val="0"/>
+          <w:i w:val="0"/>
+        </w:rPr>
+        <w:t xml:space="preserve">Nhân viên </w:t>
+      </w:r>
+      <w:r>
+        <w:rPr>
+          <w:b/>
+          <w:i w:val="0"/>
+        </w:rPr>
+        <w:t>đồng ý</w:t>
+      </w:r>
+      <w:r>
+        <w:rPr>
+          <w:b w:val="0"/>
+          <w:i w:val="0"/>
+        </w:rPr>
+        <w:t xml:space="preserve"> với báo giá → </w:t>
+      </w:r>
+      <w:r>
+        <w:rPr>
+          <w:b/>
+          <w:i w:val="0"/>
+        </w:rPr>
+        <w:t>tự làm xong</w:t>
+      </w:r>
+      <w:r>
+        <w:rPr>
+          <w:b w:val="0"/>
+          <w:i w:val="0"/>
+        </w:rPr>
+        <w:t>, đơn đi tiếp. Không cần duyệt lại.</w:t>
+      </w:r>
+    </w:p>
+    <w:p>
+      <w:pPr>
+        <w:pStyle w:val="ListBullet"/>
+      </w:pPr>
+      <w:r>
+        <w:rPr>
+          <w:b w:val="0"/>
+          <w:i w:val="0"/>
+        </w:rPr>
+        <w:t xml:space="preserve">Nhân viên muốn </w:t>
+      </w:r>
+      <w:r>
+        <w:rPr>
+          <w:b/>
+          <w:i w:val="0"/>
+        </w:rPr>
+        <w:t>đổi số lượng</w:t>
+      </w:r>
+      <w:r>
+        <w:rPr>
+          <w:b w:val="0"/>
+          <w:i w:val="0"/>
+        </w:rPr>
+        <w:t xml:space="preserve"> → phải bấm </w:t>
+      </w:r>
+      <w:r>
+        <w:rPr>
+          <w:b/>
+          <w:i w:val="0"/>
+        </w:rPr>
+        <w:t>Xin sửa số lượng</w:t>
+      </w:r>
+      <w:r>
+        <w:rPr>
+          <w:b w:val="0"/>
+          <w:i w:val="0"/>
+        </w:rPr>
+        <w:t xml:space="preserve">, phiếu quay về </w:t>
+      </w:r>
+      <w:r>
+        <w:rPr>
+          <w:b/>
+          <w:i w:val="0"/>
+        </w:rPr>
+        <w:t>Chờ duyệt sửa</w:t>
+      </w:r>
+      <w:r>
+        <w:rPr>
+          <w:b w:val="0"/>
+          <w:i w:val="0"/>
+        </w:rPr>
+        <w:t>, quản lý duyệt lần nữa rồi đơn mới đổi.</w:t>
+      </w:r>
+    </w:p>
+    <w:p>
+      <w:r>
+        <w:rPr>
+          <w:b w:val="0"/>
+          <w:i w:val="0"/>
+        </w:rPr>
+        <w:t xml:space="preserve">Nếu để nhân viên đổi thẳng thì quản lý duyệt 10 hộp mà hàng về 100 hộp — đó là lỗ hổng của chính cổng duyệt. Còn bắt duyệt lại cả khi họ chỉ </w:t>
+      </w:r>
+      <w:r>
+        <w:rPr>
+          <w:b/>
+          <w:i w:val="0"/>
+        </w:rPr>
+        <w:t>đồng ý</w:t>
+      </w:r>
+      <w:r>
+        <w:rPr>
+          <w:b w:val="0"/>
+          <w:i w:val="0"/>
+        </w:rPr>
+        <w:t xml:space="preserve"> thì làm tắc con đường thông thường mà không kiểm soát thêm được gì.</w:t>
+      </w:r>
+    </w:p>
+    <w:p>
+      <w:r>
+        <w:rPr>
+          <w:b w:val="0"/>
+          <w:i w:val="0"/>
+        </w:rPr>
+        <w:t xml:space="preserve">Số khoa xin đổi ghi ở </w:t>
+      </w:r>
+      <w:r>
+        <w:rPr>
+          <w:b/>
+          <w:i w:val="0"/>
+        </w:rPr>
+        <w:t>cột thứ ba</w:t>
+      </w:r>
+      <w:r>
+        <w:rPr>
+          <w:b w:val="0"/>
+          <w:i w:val="0"/>
+        </w:rPr>
+        <w:t xml:space="preserve"> riêng, không đè lên số đã duyệt — quản lý phải nhìn thấy cả hai để so.</w:t>
+      </w:r>
+    </w:p>
+    <w:p>
+      <w:pPr>
+        <w:pStyle w:val="Heading3"/>
+      </w:pPr>
+      <w:r>
+        <w:t>Quản lý đặt hàng trực tiếp</w:t>
+      </w:r>
+    </w:p>
+    <w:p>
+      <w:r>
+        <w:rPr>
+          <w:b w:val="0"/>
+          <w:i w:val="0"/>
+        </w:rPr>
+        <w:t xml:space="preserve">Quản lý bấm đặt trên giỏ hàng thì </w:t>
+      </w:r>
+      <w:r>
+        <w:rPr>
+          <w:b/>
+          <w:i w:val="0"/>
+        </w:rPr>
+        <w:t>vẫn chạy như trước</w:t>
+      </w:r>
+      <w:r>
+        <w:rPr>
+          <w:b w:val="0"/>
+          <w:i w:val="0"/>
+        </w:rPr>
+        <w:t xml:space="preserve">, và hệ thống </w:t>
+      </w:r>
+      <w:r>
+        <w:rPr>
+          <w:b/>
+          <w:i w:val="0"/>
+        </w:rPr>
+        <w:t>tự lập một phiếu đề xuất đã duyệt</w:t>
+      </w:r>
+      <w:r>
+        <w:rPr>
+          <w:b w:val="0"/>
+          <w:i w:val="0"/>
+        </w:rPr>
+        <w:t xml:space="preserve"> đứng sau. Không phải bấm thêm nút nào. Mục đích: </w:t>
+      </w:r>
+      <w:r>
+        <w:rPr>
+          <w:b/>
+          <w:i w:val="0"/>
+        </w:rPr>
+        <w:t>mọi đơn trên hệ thống đều có đúng một chứng từ đứng sau</w:t>
+      </w:r>
+      <w:r>
+        <w:rPr>
+          <w:b w:val="0"/>
+          <w:i w:val="0"/>
+        </w:rPr>
+        <w:t xml:space="preserve"> — không có hai loại đơn với hai lịch sử khác nhau.</w:t>
+      </w:r>
+    </w:p>
+    <w:p>
+      <w:r>
+        <w:rPr>
+          <w:b w:val="0"/>
+          <w:i w:val="0"/>
+        </w:rPr>
+        <w:t xml:space="preserve">Giỏ hàng của quản lý có ô chọn khoa phòng, mặc định </w:t>
+      </w:r>
+      <w:r>
+        <w:rPr>
+          <w:b/>
+          <w:i w:val="0"/>
+        </w:rPr>
+        <w:t>Toàn viện</w:t>
+      </w:r>
+      <w:r>
+        <w:rPr>
+          <w:b w:val="0"/>
+          <w:i w:val="0"/>
+        </w:rPr>
+        <w:t>:</w:t>
+      </w:r>
+    </w:p>
+    <w:p>
+      <w:pPr>
+        <w:pStyle w:val="ListBullet"/>
+      </w:pPr>
+      <w:r>
+        <w:rPr>
+          <w:b w:val="0"/>
+          <w:i w:val="0"/>
+        </w:rPr>
+        <w:t>Chọn một khoa → đơn thuộc khoa đó, nhân viên khoa đó nhìn thấy đơn và mọi phiếu giao, hoá đơn của nó. Dùng khi quản lý đặt hộ một khoa.</w:t>
+      </w:r>
+    </w:p>
+    <w:p>
+      <w:pPr>
+        <w:pStyle w:val="ListBullet"/>
+      </w:pPr>
+      <w:r>
+        <w:rPr>
+          <w:b w:val="0"/>
+          <w:i w:val="0"/>
+        </w:rPr>
+        <w:t xml:space="preserve">Chọn </w:t>
+      </w:r>
+      <w:r>
+        <w:rPr>
+          <w:b/>
+          <w:i w:val="0"/>
+        </w:rPr>
+        <w:t>Toàn viện</w:t>
+      </w:r>
+      <w:r>
+        <w:rPr>
+          <w:b w:val="0"/>
+          <w:i w:val="0"/>
+        </w:rPr>
+        <w:t xml:space="preserve"> → đơn không thuộc khoa nào, </w:t>
+      </w:r>
+      <w:r>
+        <w:rPr>
+          <w:b/>
+          <w:i w:val="0"/>
+        </w:rPr>
+        <w:t>chỉ quản lý thấy</w:t>
+      </w:r>
+      <w:r>
+        <w:rPr>
+          <w:b w:val="0"/>
+          <w:i w:val="0"/>
+        </w:rPr>
+        <w:t>.</w:t>
+      </w:r>
+    </w:p>
+    <w:p>
+      <w:r>
+        <w:rPr>
+          <w:b/>
+          <w:i w:val="0"/>
+        </w:rPr>
+        <w:t>Bệnh viện chưa có Mã ngắn vẫn đặt hàng được.</w:t>
+      </w:r>
+      <w:r>
+        <w:rPr>
+          <w:b w:val="0"/>
+          <w:i w:val="0"/>
+        </w:rPr>
+        <w:t xml:space="preserve"> Phiếu sinh ra sẽ không có mã tra cứu cho tới khi Miyano đặt Mã ngắn. Mã tra cứu là tiện ích đối chiếu, không phải điều kiện để mua hàng.</w:t>
+      </w:r>
+    </w:p>
+    <w:p>
+      <w:pPr>
+        <w:pStyle w:val="Heading3"/>
+      </w:pPr>
+      <w:r>
+        <w:t>Thông báo giờ gửi đúng người</w:t>
+      </w:r>
+    </w:p>
+    <w:tbl>
+      <w:tblPr>
+        <w:tblStyle w:val="TableGrid"/>
+        <w:tblW w:type="auto" w:w="0"/>
+        <w:tblLook w:firstColumn="1" w:firstRow="1" w:lastColumn="0" w:lastRow="0" w:noHBand="0" w:noVBand="1" w:val="04A0"/>
+      </w:tblPr>
+      <w:tblGrid>
+        <w:gridCol w:w="4320"/>
+        <w:gridCol w:w="4320"/>
+      </w:tblGrid>
+      <w:tr>
+        <w:tc>
+          <w:tcPr>
+            <w:tcW w:type="dxa" w:w="4320"/>
+          </w:tcPr>
+          <w:p>
+            <w:r>
+              <w:rPr>
+                <w:b/>
+              </w:rPr>
+            </w:r>
+            <w:r>
+              <w:rPr>
+                <w:b/>
+                <w:i w:val="0"/>
+              </w:rPr>
+              <w:t>Việc</w:t>
+            </w:r>
+          </w:p>
+        </w:tc>
+        <w:tc>
+          <w:tcPr>
+            <w:tcW w:type="dxa" w:w="4320"/>
+          </w:tcPr>
+          <w:p>
+            <w:r>
+              <w:rPr>
+                <w:b/>
+              </w:rPr>
+            </w:r>
+            <w:r>
+              <w:rPr>
+                <w:b/>
+                <w:i w:val="0"/>
+              </w:rPr>
+              <w:t>Ai nhận</w:t>
+            </w:r>
+          </w:p>
+        </w:tc>
+      </w:tr>
+      <w:tr>
+        <w:tc>
+          <w:tcPr>
+            <w:tcW w:type="dxa" w:w="4320"/>
+          </w:tcPr>
+          <w:p>
+            <w:r/>
+            <w:r>
+              <w:rPr>
+                <w:b w:val="0"/>
+                <w:i w:val="0"/>
+              </w:rPr>
+              <w:t>Khoa gửi đề xuất</w:t>
+            </w:r>
+          </w:p>
+        </w:tc>
+        <w:tc>
+          <w:tcPr>
+            <w:tcW w:type="dxa" w:w="4320"/>
+          </w:tcPr>
+          <w:p>
+            <w:r/>
+            <w:r>
+              <w:rPr>
+                <w:b w:val="0"/>
+                <w:i w:val="0"/>
+              </w:rPr>
+              <w:t>Quản lý</w:t>
+            </w:r>
+          </w:p>
+        </w:tc>
+      </w:tr>
+      <w:tr>
+        <w:tc>
+          <w:tcPr>
+            <w:tcW w:type="dxa" w:w="4320"/>
+          </w:tcPr>
+          <w:p>
+            <w:r/>
+            <w:r>
+              <w:rPr>
+                <w:b w:val="0"/>
+                <w:i w:val="0"/>
+              </w:rPr>
+              <w:t>Quản lý duyệt / từ chối</w:t>
+            </w:r>
+          </w:p>
+        </w:tc>
+        <w:tc>
+          <w:tcPr>
+            <w:tcW w:type="dxa" w:w="4320"/>
+          </w:tcPr>
+          <w:p>
+            <w:r/>
+            <w:r>
+              <w:rPr>
+                <w:b w:val="0"/>
+                <w:i w:val="0"/>
+              </w:rPr>
+              <w:t>Người lập phiếu + thành viên khác của khoa đó</w:t>
+            </w:r>
+          </w:p>
+        </w:tc>
+      </w:tr>
+      <w:tr>
+        <w:tc>
+          <w:tcPr>
+            <w:tcW w:type="dxa" w:w="4320"/>
+          </w:tcPr>
+          <w:p>
+            <w:r/>
+            <w:r>
+              <w:rPr>
+                <w:b w:val="0"/>
+                <w:i w:val="0"/>
+              </w:rPr>
+              <w:t>Miyano hẹn giao, giao hàng</w:t>
+            </w:r>
+          </w:p>
+        </w:tc>
+        <w:tc>
+          <w:tcPr>
+            <w:tcW w:type="dxa" w:w="4320"/>
+          </w:tcPr>
+          <w:p>
+            <w:r/>
+            <w:r>
+              <w:rPr>
+                <w:b w:val="0"/>
+                <w:i w:val="0"/>
+              </w:rPr>
+              <w:t>Quản lý + thành viên của khoa đứng tên đơn</w:t>
+            </w:r>
+          </w:p>
+        </w:tc>
+      </w:tr>
+    </w:tbl>
+    <w:p/>
+    <w:p>
+      <w:r>
+        <w:rPr>
+          <w:b w:val="0"/>
+          <w:i w:val="0"/>
+        </w:rPr>
+        <w:t xml:space="preserve">Trước đây thông báo giao hàng gửi cho </w:t>
+      </w:r>
+      <w:r>
+        <w:rPr>
+          <w:b/>
+          <w:i w:val="0"/>
+        </w:rPr>
+        <w:t>mọi</w:t>
+      </w:r>
+      <w:r>
+        <w:rPr>
+          <w:b w:val="0"/>
+          <w:i w:val="0"/>
+        </w:rPr>
+        <w:t xml:space="preserve"> tài khoản của bệnh viện. Với một tài khoản thì đúng; với mười lăm tài khoản thì khoa Dược nhận thông báo về hàng của khoa Huyết học mỗi ngày.</w:t>
+      </w:r>
+    </w:p>
+    <w:p>
+      <w:r>
+        <w:rPr>
+          <w:b/>
+          <w:i w:val="0"/>
+        </w:rPr>
+        <w:t>Một ngoại lệ còn lại:</w:t>
+      </w:r>
+      <w:r>
+        <w:rPr>
+          <w:b w:val="0"/>
+          <w:i w:val="0"/>
+        </w:rPr>
+        <w:t xml:space="preserve"> thông báo </w:t>
+      </w:r>
+      <w:r>
+        <w:rPr>
+          <w:b w:val="0"/>
+          <w:i/>
+        </w:rPr>
+        <w:t>"Miyano đã xác nhận đơn"</w:t>
+      </w:r>
+      <w:r>
+        <w:rPr>
+          <w:b w:val="0"/>
+          <w:i w:val="0"/>
+        </w:rPr>
+        <w:t xml:space="preserve"> vẫn gửi theo email liên hệ trên đơn, không lọc theo khoa — thông báo đó do nền tảng Frappe tự định tuyến, phần mềm mình không chen vào được. Không phải quên, là giới hạn kỹ thuật thật.</w:t>
+      </w:r>
+    </w:p>
+    <w:p>
+      <w:pPr>
+        <w:jc w:val="center"/>
+      </w:pPr>
+      <w:r>
+        <w:t>────────────────────────────────────────────────────────────</w:t>
+      </w:r>
+    </w:p>
+    <w:p>
+      <w:pPr>
+        <w:pStyle w:val="Heading2"/>
+      </w:pPr>
+      <w:r>
+        <w:t>5. Gặp lỗi thì tra ở đây</w:t>
       </w:r>
     </w:p>
     <w:tbl>
@@ -2709,7 +4178,7 @@
         <w:pStyle w:val="Heading2"/>
       </w:pPr>
       <w:r>
-        <w:t>5. Checklist triển khai — đọc trước khi lên bản</w:t>
+        <w:t>6. Checklist triển khai — đọc trước khi lên bản</w:t>
       </w:r>
     </w:p>
     <w:p>
@@ -2866,18 +4335,83 @@
           <w:rFonts w:ascii="Consolas" w:hAnsi="Consolas"/>
           <w:sz w:val="18"/>
         </w:rPr>
-        <w:t>-- phải trả về 1 dòng</w:t>
+        <w:t>-- phải trả về 3 dòng (bản này thêm 2 cột nữa cho luồng đề xuất)</w:t>
         <w:br/>
-        <w:t>select 1 from information_schema.columns</w:t>
+        <w:t>select column_name from information_schema.columns</w:t>
         <w:br/>
-        <w:t xml:space="preserve"> where table_name='tabSales Order' and column_name='custom_khoa_phong';</w:t>
+        <w:t xml:space="preserve"> where table_name='tabSales Order'</w:t>
+        <w:br/>
+        <w:t xml:space="preserve">   and column_name in ('custom_khoa_phong','custom_de_xuat','custom_ma_tra_cuu');</w:t>
         <w:br/>
         <w:br/>
-        <w:t>-- phải có dòng, và skipped = 0</w:t>
+        <w:t>-- phải có dòng cho CẢ HAI patch, và skipped = 0</w:t>
         <w:br/>
-        <w:t>select name, creation, skipped from `tabPatch Log`</w:t>
+        <w:t>select name, patch, creation, skipped from `tabPatch Log`</w:t>
         <w:br/>
-        <w:t xml:space="preserve"> where patch like '%them_khoa_phong_vao_don_hang%';</w:t>
+        <w:t xml:space="preserve"> where patch like '%them_khoa_phong_vao_don_hang%'</w:t>
+        <w:br/>
+        <w:t xml:space="preserve">    or patch like '%them_de_xuat_vao_don_hang%';</w:t>
+      </w:r>
+    </w:p>
+    <w:p>
+      <w:r>
+        <w:rPr>
+          <w:b/>
+          <w:i w:val="0"/>
+        </w:rPr>
+        <w:t>Bản này có hai patch, không phải một.</w:t>
+      </w:r>
+      <w:r>
+        <w:rPr>
+          <w:b w:val="0"/>
+          <w:i w:val="0"/>
+        </w:rPr>
+        <w:t xml:space="preserve"> Patch cũ thêm cột khoa phòng; patch mới (</w:t>
+      </w:r>
+      <w:r>
+        <w:rPr>
+          <w:rFonts w:ascii="Consolas" w:hAnsi="Consolas"/>
+          <w:b w:val="0"/>
+          <w:i w:val="0"/>
+          <w:color w:val="B03030"/>
+          <w:sz w:val="19"/>
+        </w:rPr>
+        <w:t>v1_24</w:t>
+      </w:r>
+      <w:r>
+        <w:rPr>
+          <w:b w:val="0"/>
+          <w:i w:val="0"/>
+        </w:rPr>
+        <w:t xml:space="preserve">) thêm hai cột trỏ về phiếu đề xuất và mã tra cứu. Thiếu patch mới thì chốt "nhân viên không sửa số lượng sau khi đã duyệt" </w:t>
+      </w:r>
+      <w:r>
+        <w:rPr>
+          <w:b/>
+          <w:i w:val="0"/>
+        </w:rPr>
+        <w:t>không có gì để đọc</w:t>
+      </w:r>
+      <w:r>
+        <w:rPr>
+          <w:b w:val="0"/>
+          <w:i w:val="0"/>
+        </w:rPr>
+        <w:t xml:space="preserve"> — hệ thống sẽ </w:t>
+      </w:r>
+      <w:r>
+        <w:rPr>
+          <w:b/>
+          <w:i w:val="0"/>
+        </w:rPr>
+        <w:t>chặn nhân viên khoa</w:t>
+      </w:r>
+      <w:r>
+        <w:rPr>
+          <w:b w:val="0"/>
+          <w:i w:val="0"/>
+        </w:rPr>
+        <w:t xml:space="preserve"> kèm thông báo "Hệ thống chưa hoàn tất cập nhật", chứ không mở toang. An toàn, nhưng họ không làm việc được cho tới khi anh chạy migrate.</w:t>
       </w:r>
     </w:p>
     <w:p>
@@ -2926,7 +4460,7 @@
         <w:pStyle w:val="Heading2"/>
       </w:pPr>
       <w:r>
-        <w:t>6. Hệ thống cố ý CHƯA làm</w:t>
+        <w:t>7. Hệ thống cố ý CHƯA làm</w:t>
       </w:r>
     </w:p>
     <w:p>
@@ -3010,14 +4544,65 @@
           <w:b/>
           <w:i w:val="0"/>
         </w:rPr>
-        <w:t>Chưa có phiếu Đề xuất mua và luồng duyệt.</w:t>
+        <w:t>Chưa có màn hình riêng cho luồng duyệt.</w:t>
       </w:r>
       <w:r>
         <w:rPr>
           <w:b w:val="0"/>
           <w:i w:val="0"/>
         </w:rPr>
-        <w:t xml:space="preserve"> Nhân viên khoa hiện đặt hàng thẳng như trước, chỉ khác là đơn được đóng dấu khoa. Bước 5–6.</w:t>
+        <w:t xml:space="preserve"> Phần lõi đã chạy (§4) nhưng ba màn </w:t>
+      </w:r>
+      <w:r>
+        <w:rPr>
+          <w:rFonts w:ascii="Consolas" w:hAnsi="Consolas"/>
+          <w:b w:val="0"/>
+          <w:i w:val="0"/>
+          <w:color w:val="B03030"/>
+          <w:sz w:val="19"/>
+        </w:rPr>
+        <w:t>/de-xuat</w:t>
+      </w:r>
+      <w:r>
+        <w:rPr>
+          <w:b w:val="0"/>
+          <w:i w:val="0"/>
+        </w:rPr>
+        <w:t xml:space="preserve">, </w:t>
+      </w:r>
+      <w:r>
+        <w:rPr>
+          <w:rFonts w:ascii="Consolas" w:hAnsi="Consolas"/>
+          <w:b w:val="0"/>
+          <w:i w:val="0"/>
+          <w:color w:val="B03030"/>
+          <w:sz w:val="19"/>
+        </w:rPr>
+        <w:t>/duyet</w:t>
+      </w:r>
+      <w:r>
+        <w:rPr>
+          <w:b w:val="0"/>
+          <w:i w:val="0"/>
+        </w:rPr>
+        <w:t xml:space="preserve">, </w:t>
+      </w:r>
+      <w:r>
+        <w:rPr>
+          <w:rFonts w:ascii="Consolas" w:hAnsi="Consolas"/>
+          <w:b w:val="0"/>
+          <w:i w:val="0"/>
+          <w:color w:val="B03030"/>
+          <w:sz w:val="19"/>
+        </w:rPr>
+        <w:t>/thanh-vien</w:t>
+      </w:r>
+      <w:r>
+        <w:rPr>
+          <w:b w:val="0"/>
+          <w:i w:val="0"/>
+        </w:rPr>
+        <w:t xml:space="preserve"> và ô tìm theo tên vật tư chưa dựng — thuộc kế hoạch B. Tới lúc đó quản lý duyệt qua màn quản trị, chưa có màn gọn cho họ.</w:t>
       </w:r>
     </w:p>
     <w:p>
@@ -3036,7 +4621,21 @@
           <w:b w:val="0"/>
           <w:i w:val="0"/>
         </w:rPr>
-        <w:t xml:space="preserve"> Quản lý đi vắng thì chưa có ai duyệt thay. Bước 7.</w:t>
+        <w:t xml:space="preserve"> Quản lý đi vắng thì chưa có ai duyệt thay — thuộc kế hoạch C. 3b. </w:t>
+      </w:r>
+      <w:r>
+        <w:rPr>
+          <w:b/>
+          <w:i w:val="0"/>
+        </w:rPr>
+        <w:t>Vòng "duyệt sửa" chưa ghi mốc riêng.</w:t>
+      </w:r>
+      <w:r>
+        <w:rPr>
+          <w:b w:val="0"/>
+          <w:i w:val="0"/>
+        </w:rPr>
+        <w:t xml:space="preserve"> Khi quản lý duyệt một yêu cầu sửa số lượng, phiếu không ghi thêm người duyệt và thời điểm cho vòng đó — khối truy vết vẫn chỉ mang dấu của lần duyệt đầu.</w:t>
       </w:r>
     </w:p>
     <w:p>
@@ -4178,6 +5777,154 @@
           </w:p>
         </w:tc>
       </w:tr>
+      <w:tr>
+        <w:tc>
+          <w:tcPr>
+            <w:tcW w:type="dxa" w:w="2880"/>
+          </w:tcPr>
+          <w:p>
+            <w:r/>
+            <w:r>
+              <w:rPr>
+                <w:rFonts w:ascii="Consolas" w:hAnsi="Consolas"/>
+                <w:b w:val="0"/>
+                <w:i w:val="0"/>
+                <w:color w:val="B03030"/>
+                <w:sz w:val="19"/>
+              </w:rPr>
+              <w:t>custom_de_xuat</w:t>
+            </w:r>
+          </w:p>
+        </w:tc>
+        <w:tc>
+          <w:tcPr>
+            <w:tcW w:type="dxa" w:w="2880"/>
+          </w:tcPr>
+          <w:p>
+            <w:r/>
+            <w:r>
+              <w:rPr>
+                <w:b w:val="0"/>
+                <w:i w:val="0"/>
+              </w:rPr>
+              <w:t>Link Portal De Xuat Mua</w:t>
+            </w:r>
+          </w:p>
+        </w:tc>
+        <w:tc>
+          <w:tcPr>
+            <w:tcW w:type="dxa" w:w="2880"/>
+          </w:tcPr>
+          <w:p>
+            <w:r/>
+            <w:r>
+              <w:rPr>
+                <w:b/>
+                <w:i w:val="0"/>
+              </w:rPr>
+              <w:t>chỉ đọc</w:t>
+            </w:r>
+            <w:r>
+              <w:rPr>
+                <w:b w:val="0"/>
+                <w:i w:val="0"/>
+              </w:rPr>
+              <w:t>, trỏ ngược về phiếu đề xuất sinh ra đơn. 102 đơn cũ để trống</w:t>
+            </w:r>
+          </w:p>
+        </w:tc>
+      </w:tr>
+      <w:tr>
+        <w:tc>
+          <w:tcPr>
+            <w:tcW w:type="dxa" w:w="2880"/>
+          </w:tcPr>
+          <w:p>
+            <w:r/>
+            <w:r>
+              <w:rPr>
+                <w:rFonts w:ascii="Consolas" w:hAnsi="Consolas"/>
+                <w:b w:val="0"/>
+                <w:i w:val="0"/>
+                <w:color w:val="B03030"/>
+                <w:sz w:val="19"/>
+              </w:rPr>
+              <w:t>custom_ma_tra_cuu</w:t>
+            </w:r>
+          </w:p>
+        </w:tc>
+        <w:tc>
+          <w:tcPr>
+            <w:tcW w:type="dxa" w:w="2880"/>
+          </w:tcPr>
+          <w:p>
+            <w:r/>
+            <w:r>
+              <w:rPr>
+                <w:b w:val="0"/>
+                <w:i w:val="0"/>
+              </w:rPr>
+              <w:t>Data</w:t>
+            </w:r>
+          </w:p>
+        </w:tc>
+        <w:tc>
+          <w:tcPr>
+            <w:tcW w:type="dxa" w:w="2880"/>
+          </w:tcPr>
+          <w:p>
+            <w:r/>
+            <w:r>
+              <w:rPr>
+                <w:b w:val="0"/>
+                <w:i w:val="0"/>
+              </w:rPr>
+              <w:t>mã dễ đọc của khách (</w:t>
+            </w:r>
+            <w:r>
+              <w:rPr>
+                <w:rFonts w:ascii="Consolas" w:hAnsi="Consolas"/>
+                <w:b w:val="0"/>
+                <w:i w:val="0"/>
+                <w:color w:val="B03030"/>
+                <w:sz w:val="19"/>
+              </w:rPr>
+              <w:t>BM-HUYETHOC-260819-01</w:t>
+            </w:r>
+            <w:r>
+              <w:rPr>
+                <w:b w:val="0"/>
+                <w:i w:val="0"/>
+              </w:rPr>
+              <w:t xml:space="preserve">). Tên đơn trên hệ thống </w:t>
+            </w:r>
+            <w:r>
+              <w:rPr>
+                <w:b/>
+                <w:i w:val="0"/>
+              </w:rPr>
+              <w:t xml:space="preserve">vẫn là </w:t>
+            </w:r>
+            <w:r>
+              <w:rPr>
+                <w:rFonts w:ascii="Consolas" w:hAnsi="Consolas"/>
+                <w:b/>
+                <w:i w:val="0"/>
+                <w:color w:val="B03030"/>
+                <w:sz w:val="19"/>
+              </w:rPr>
+              <w:t>SAL-ORD-*</w:t>
+            </w:r>
+            <w:r>
+              <w:rPr>
+                <w:b w:val="0"/>
+                <w:i w:val="0"/>
+              </w:rPr>
+              <w:t xml:space="preserve"> — Miyano thấy cả hai, khách thấy mã của họ</w:t>
+            </w:r>
+          </w:p>
+        </w:tc>
+      </w:tr>
     </w:tbl>
     <w:p/>
     <w:sectPr>

</xml_diff>

<commit_message>
docs(hdsd): khong huong quan ly benh vien 'vao Desk' - ho la Website User
Muc "Thao tac tren man hinh" (§4) noi quan ly khong tu them mat hang duoc
thi "phai lam tren Desk" — dung cai cua ma chinh C1 ton tai vi ho KHONG
mo duoc. Ghi lai dung nguoi lam thay: bao nhan vien Miyano. Sinh lai .docx.

Co-Authored-By: Claude Opus 5 (1M context) <noreply@anthropic.com>
</commit_message>
<xml_diff>
--- a/docs/HDSD-phan-quyen-khoa-phong.docx
+++ b/docs/HDSD-phan-quyen-khoa-phong.docx
@@ -4219,7 +4219,7 @@
           <w:b w:val="0"/>
           <w:i w:val="0"/>
         </w:rPr>
-        <w:t xml:space="preserve"> cho quản lý (§4 nói quản lý được thêm dòng — phần lõi làm được, nhưng phải làm trên Desk). Trên cổng, quản lý hiện chỉ </w:t>
+        <w:t xml:space="preserve"> cho quản lý. Trên cổng, quản lý hiện chỉ </w:t>
       </w:r>
       <w:r>
         <w:rPr>
@@ -4233,7 +4233,49 @@
           <w:b w:val="0"/>
           <w:i w:val="0"/>
         </w:rPr>
-        <w:t>.</w:t>
+        <w:t xml:space="preserve"> — muốn </w:t>
+      </w:r>
+      <w:r>
+        <w:rPr>
+          <w:b/>
+          <w:i w:val="0"/>
+        </w:rPr>
+        <w:t>thêm</w:t>
+      </w:r>
+      <w:r>
+        <w:rPr>
+          <w:b w:val="0"/>
+          <w:i w:val="0"/>
+        </w:rPr>
+        <w:t xml:space="preserve"> một mặt hàng mà khoa không xin thì </w:t>
+      </w:r>
+      <w:r>
+        <w:rPr>
+          <w:b/>
+          <w:i w:val="0"/>
+        </w:rPr>
+        <w:t>quản lý bệnh viện không tự làm được</w:t>
+      </w:r>
+      <w:r>
+        <w:rPr>
+          <w:b w:val="0"/>
+          <w:i w:val="0"/>
+        </w:rPr>
+        <w:t xml:space="preserve">, phải báo nhân viên Miyano thêm giúp trên Desk. (Tài khoản bệnh viện là Website User, </w:t>
+      </w:r>
+      <w:r>
+        <w:rPr>
+          <w:b/>
+          <w:i w:val="0"/>
+        </w:rPr>
+        <w:t>không vào được</w:t>
+      </w:r>
+      <w:r>
+        <w:rPr>
+          <w:b w:val="0"/>
+          <w:i w:val="0"/>
+        </w:rPr>
+        <w:t xml:space="preserve"> màn quản trị — đừng hướng dẫn họ "vào Desk mà làm".)</w:t>
       </w:r>
     </w:p>
     <w:p>

</xml_diff>